<commit_message>
feat(docs): ganti judul -> Hubungan Kestabilan Temporal ... (14 kata)
- judul baru: Hubungan Kestabilan Temporal Subset Fitur XGBoost Berbasis
  Jaccard dengan Error Prediksi Out-of-Sample Return Bitcoin (14 kata)
- propagate ke BAGIAN AWAL.docx (6 titik) + BAB I - III_FIXED.docx (1 titik)
- backup _PRETITLE2.docx; update IDENTITAS-MAHASISWA.md + laporan (section J)
</commit_message>
<xml_diff>
--- a/docs/HASIL-FIX/BAGIAN AWAL.docx
+++ b/docs/HASIL-FIX/BAGIAN AWAL.docx
@@ -69,7 +69,7 @@
           <w:i w:val="0"/>
           <w:sz w:val="28"/>
         </w:rPr>
-        <w:t>ANALISIS KESTABILAN TEMPORAL SUBSET FITUR XGBOOST BERBASIS JACCARD DAN HUBUNGANNYA DENGAN ERROR PREDIKSI OUT-OF-SAMPLE PADA RETURN BITCOIN</w:t>
+        <w:t>HUBUNGAN KESTABILAN TEMPORAL SUBSET FITUR XGBOOST BERBASIS JACCARD DENGAN ERROR PREDIKSI OUT-OF-SAMPLE RETURN BITCOIN</w:t>
       </w:r>
     </w:p>
     <w:p>
@@ -277,7 +277,7 @@
           <w:i w:val="0"/>
           <w:sz w:val="24"/>
         </w:rPr>
-        <w:t>Zaini Leon Musthofa Kamal, 231240001455, Analisis Kestabilan Temporal Subset Fitur XGBoost Berbasis Jaccard dan Hubungannya dengan Error Prediksi Out-of-Sample pada Return Bitcoin, [Tahun].</w:t>
+        <w:t>Zaini Leon Musthofa Kamal, 231240001455, Hubungan Kestabilan Temporal Subset Fitur XGBoost Berbasis Jaccard dengan Error Prediksi Out-of-Sample Return Bitcoin, [Tahun].</w:t>
       </w:r>
     </w:p>
     <w:p>
@@ -506,7 +506,7 @@
           <w:i w:val="0"/>
           <w:sz w:val="24"/>
         </w:rPr>
-        <w:t>menyatakan dengan sesungguhnya bahwa Skripsi yang berjudul “Analisis Kestabilan Temporal Subset Fitur XGBoost Berbasis Jaccard dan Hubungannya dengan Error Prediksi Out-of-Sample pada Return Bitcoin” merupakan karya saya sendiri, bukan plagiasi dari karya orang lain, dan belum pernah diajukan sebagai syarat memperoleh gelar kesarjanaan di perguruan tinggi mana pun.</w:t>
+        <w:t>menyatakan dengan sesungguhnya bahwa Skripsi yang berjudul “Hubungan Kestabilan Temporal Subset Fitur XGBoost Berbasis Jaccard dengan Error Prediksi Out-of-Sample Return Bitcoin” merupakan karya saya sendiri, bukan plagiasi dari karya orang lain, dan belum pernah diajukan sebagai syarat memperoleh gelar kesarjanaan di perguruan tinggi mana pun.</w:t>
       </w:r>
     </w:p>
     <w:p>
@@ -658,7 +658,7 @@
           <w:i w:val="0"/>
           <w:sz w:val="24"/>
         </w:rPr>
-        <w:t>“Analisis Kestabilan Temporal Subset Fitur XGBoost Berbasis Jaccard dan Hubungannya dengan Error Prediksi Out-of-Sample pada Return Bitcoin”</w:t>
+        <w:t>“Hubungan Kestabilan Temporal Subset Fitur XGBoost Berbasis Jaccard dengan Error Prediksi Out-of-Sample Return Bitcoin”</w:t>
       </w:r>
     </w:p>
     <w:p>
@@ -912,7 +912,7 @@
           <w:i w:val="0"/>
           <w:sz w:val="24"/>
         </w:rPr>
-        <w:t>“Analisis Kestabilan Temporal Subset Fitur XGBoost Berbasis Jaccard dan Hubungannya dengan Error Prediksi Out-of-Sample pada Return Bitcoin”</w:t>
+        <w:t>“Hubungan Kestabilan Temporal Subset Fitur XGBoost Berbasis Jaccard dengan Error Prediksi Out-of-Sample Return Bitcoin”</w:t>
       </w:r>
     </w:p>
     <w:p>
@@ -1328,7 +1328,7 @@
           <w:i w:val="0"/>
           <w:sz w:val="24"/>
         </w:rPr>
-        <w:t>Dengan memanjatkan puji dan syukur kepada Allah Swt. yang telah melimpahkan rahmat, taufik, dan hidayah-Nya, penulis dapat menyelesaikan skripsi dengan judul “Analisis Kestabilan Temporal Subset Fitur XGBoost Berbasis Jaccard dan Hubungannya dengan Error Prediksi Out-of-Sample pada Return Bitcoin” dengan baik.</w:t>
+        <w:t>Dengan memanjatkan puji dan syukur kepada Allah Swt. yang telah melimpahkan rahmat, taufik, dan hidayah-Nya, penulis dapat menyelesaikan skripsi dengan judul “Hubungan Kestabilan Temporal Subset Fitur XGBoost Berbasis Jaccard dengan Error Prediksi Out-of-Sample Return Bitcoin” dengan baik.</w:t>
       </w:r>
     </w:p>
     <w:p>

</xml_diff>